<commit_message>
Add Ageing Report: POS Referral to POS conversion tracking
Adds joining_date (stamped on approval) and pos_conversion_date
(stamped on manual conversion) to users_data, a new POST
.../convert-to-pos admin action, and a GET .../reports/ageing endpoint
reporting date of joining, conversion date, ageing days, and whether
each record is within the 90-day target. Updates Swagger/OpenAPI,
Postman collection, and process docs to match.

Co-Authored-By: Claude Sonnet 5 <noreply@anthropic.com>
</commit_message>
<xml_diff>
--- a/SYSTEM_PROCESS.docx
+++ b/SYSTEM_PROCESS.docx
@@ -17,12 +17,12 @@
     </w:p>
     <w:p>
       <w:r>
-        <w:t>It complements README.md (backend setup, project layout), FRONTEND_INTEGRATION.md (code-level snippets for the onboarding link page), and postman_collection.json (ready-to-run requests for every endpoint).</w:t>
+        <w:t>It complements README.md (backend setup, project layout), FRONTEND_INTEGRATION.md (code-level snippets for the onboarding link page), and the Postman collection (ready-to-run requests for every endpoint).</w:t>
       </w:r>
     </w:p>
     <w:p>
       <w:r>
-        <w:t>The backend is built around exactly 2 database tables on SQL Server: users_data (one row per POS / POS Referral) and document_details (PAN / Aadhaar / Education fields extracted from the uploaded documents, one row per users_data record). Both tables use human-readable ids instead of UUIDs — e.g. TKT-12-09-2026-143059-7 and DOC-12-09-2026-143059-4 — built from the current date/time plus a number from a native SQL Server SEQUENCE, so two records created in the same second never collide.</w:t>
+        <w:t>The backend runs on SQL Server with 2 core tables: users_data (one row per POS / POS Referral) and document_details (PAN / Aadhaar / Education fields extracted from uploaded documents, one row per users_data record). Both tables use human-readable ids instead of UUIDs — e.g. TKT-12-09-2026-143059-7 and DOC-12-09-2026-143059-4 — built from the current date/time plus a number from a native SQL Server SEQUENCE, so two records created in the same second never collide.</w:t>
       </w:r>
     </w:p>
     <w:p>
@@ -166,7 +166,7 @@
           </w:tcPr>
           <w:p>
             <w:r>
-              <w:t>Reviews submitted records, approves / rejects / sends back</w:t>
+              <w:t>Reviews submitted records, approves / rejects / sends back, and later converts an active POS Referral to a full POS</w:t>
             </w:r>
           </w:p>
         </w:tc>
@@ -185,7 +185,7 @@
     <w:p/>
     <w:p>
       <w:r>
-        <w:t>The FastAPI backend has no login of its own — it assumes SM and Ops screens sit behind your existing auth, trusting whatever caller identity you pass in (raised_by, reviewed_by). The onboarding link is the one deliberately "public" part of the system — the token is what makes that safe.</w:t>
+        <w:t>The FastAPI backend has no login of its own — it assumes SM and Ops screens sit behind your existing auth, trusting whatever caller identity you pass in (raised_by, reviewed_by, converted_by). The onboarding link is the one deliberately "public" part of the system — the token is what makes that safe.</w:t>
       </w:r>
     </w:p>
     <w:p>
@@ -752,7 +752,111 @@
           </w:tcPr>
           <w:p>
             <w:r>
-              <w:t>status + reviewed_by updated; token rotated if SEND_BACK</w:t>
+              <w:t>status + reviewed_by updated; joining_date stamped on APPROVE; token rotated if SEND_BACK</w:t>
+            </w:r>
+          </w:p>
+        </w:tc>
+      </w:tr>
+      <w:tr>
+        <w:tc>
+          <w:tcPr>
+            <w:tcW w:type="dxa" w:w="1728"/>
+          </w:tcPr>
+          <w:p>
+            <w:r>
+              <w:t>10</w:t>
+            </w:r>
+          </w:p>
+        </w:tc>
+        <w:tc>
+          <w:tcPr>
+            <w:tcW w:type="dxa" w:w="1728"/>
+          </w:tcPr>
+          <w:p>
+            <w:r>
+              <w:t>Ops</w:t>
+            </w:r>
+          </w:p>
+        </w:tc>
+        <w:tc>
+          <w:tcPr>
+            <w:tcW w:type="dxa" w:w="1728"/>
+          </w:tcPr>
+          <w:p>
+            <w:r>
+              <w:t>(POS Referral only, later) Converts to POS</w:t>
+            </w:r>
+          </w:p>
+        </w:tc>
+        <w:tc>
+          <w:tcPr>
+            <w:tcW w:type="dxa" w:w="1728"/>
+          </w:tcPr>
+          <w:p>
+            <w:r>
+              <w:t>POST /api/v1/admin/onboarding/{id}/convert-to-pos</w:t>
+            </w:r>
+          </w:p>
+        </w:tc>
+        <w:tc>
+          <w:tcPr>
+            <w:tcW w:type="dxa" w:w="1728"/>
+          </w:tcPr>
+          <w:p>
+            <w:r>
+              <w:t>user_type → POS, pos_conversion_date stamped</w:t>
+            </w:r>
+          </w:p>
+        </w:tc>
+      </w:tr>
+      <w:tr>
+        <w:tc>
+          <w:tcPr>
+            <w:tcW w:type="dxa" w:w="1728"/>
+          </w:tcPr>
+          <w:p>
+            <w:r>
+              <w:t>11</w:t>
+            </w:r>
+          </w:p>
+        </w:tc>
+        <w:tc>
+          <w:tcPr>
+            <w:tcW w:type="dxa" w:w="1728"/>
+          </w:tcPr>
+          <w:p>
+            <w:r>
+              <w:t>Ops</w:t>
+            </w:r>
+          </w:p>
+        </w:tc>
+        <w:tc>
+          <w:tcPr>
+            <w:tcW w:type="dxa" w:w="1728"/>
+          </w:tcPr>
+          <w:p>
+            <w:r>
+              <w:t>Views the Ageing Report</w:t>
+            </w:r>
+          </w:p>
+        </w:tc>
+        <w:tc>
+          <w:tcPr>
+            <w:tcW w:type="dxa" w:w="1728"/>
+          </w:tcPr>
+          <w:p>
+            <w:r>
+              <w:t>GET /api/v1/admin/reports/ageing</w:t>
+            </w:r>
+          </w:p>
+        </w:tc>
+        <w:tc>
+          <w:tcPr>
+            <w:tcW w:type="dxa" w:w="1728"/>
+          </w:tcPr>
+          <w:p>
+            <w:r>
+              <w:t>Reads joining_date / pos_conversion_date across all referral records</w:t>
             </w:r>
           </w:p>
         </w:tc>
@@ -947,7 +1051,7 @@
           </w:tcPr>
           <w:p>
             <w:r>
-              <w:t>APPROVED → ACTIVE</w:t>
+              <w:t>APPROVED → ACTIVE (joining_date stamped)</w:t>
             </w:r>
           </w:p>
         </w:tc>
@@ -1012,6 +1116,38 @@
           <w:p>
             <w:r>
               <w:t>SEND_BACK (new token issued, POS/Referral must redo form/docs on the new link)</w:t>
+            </w:r>
+          </w:p>
+        </w:tc>
+      </w:tr>
+      <w:tr>
+        <w:tc>
+          <w:tcPr>
+            <w:tcW w:type="dxa" w:w="2880"/>
+          </w:tcPr>
+          <w:p>
+            <w:r>
+              <w:t>ACTIVE (user_type=POS_REFERRAL only)</w:t>
+            </w:r>
+          </w:p>
+        </w:tc>
+        <w:tc>
+          <w:tcPr>
+            <w:tcW w:type="dxa" w:w="2880"/>
+          </w:tcPr>
+          <w:p>
+            <w:r>
+              <w:t>Ops converts to POS</w:t>
+            </w:r>
+          </w:p>
+        </w:tc>
+        <w:tc>
+          <w:tcPr>
+            <w:tcW w:type="dxa" w:w="2880"/>
+          </w:tcPr>
+          <w:p>
+            <w:r>
+              <w:t>status stays ACTIVE; user_type → POS, pos_conversion_date stamped</w:t>
             </w:r>
           </w:p>
         </w:tc>
@@ -1466,6 +1602,50 @@
           </w:p>
         </w:tc>
       </w:tr>
+      <w:tr>
+        <w:tc>
+          <w:tcPr>
+            <w:tcW w:type="dxa" w:w="4320"/>
+          </w:tcPr>
+          <w:p>
+            <w:r>
+              <w:t>"Convert to POS" button (shown only for an ACTIVE POS Referral)</w:t>
+            </w:r>
+          </w:p>
+        </w:tc>
+        <w:tc>
+          <w:tcPr>
+            <w:tcW w:type="dxa" w:w="4320"/>
+          </w:tcPr>
+          <w:p>
+            <w:r>
+              <w:t>POST /api/v1/admin/onboarding/{id}/convert-to-pos</w:t>
+            </w:r>
+          </w:p>
+        </w:tc>
+      </w:tr>
+      <w:tr>
+        <w:tc>
+          <w:tcPr>
+            <w:tcW w:type="dxa" w:w="4320"/>
+          </w:tcPr>
+          <w:p>
+            <w:r>
+              <w:t>Ageing Report screen</w:t>
+            </w:r>
+          </w:p>
+        </w:tc>
+        <w:tc>
+          <w:tcPr>
+            <w:tcW w:type="dxa" w:w="4320"/>
+          </w:tcPr>
+          <w:p>
+            <w:r>
+              <w:t>GET /api/v1/admin/reports/ageing</w:t>
+            </w:r>
+          </w:p>
+        </w:tc>
+      </w:tr>
     </w:tbl>
     <w:p/>
     <w:p>
@@ -1473,12 +1653,12 @@
         <w:pStyle w:val="Heading1"/>
       </w:pPr>
       <w:r>
-        <w:t>5. Data Model — Exactly 2 Tables</w:t>
+        <w:t>5. Data Model</w:t>
       </w:r>
     </w:p>
     <w:p>
       <w:r>
-        <w:t>users_data (Table-1): id, name, number, user_type, onboarding_link, dob, email, city, state, pincode, pan_card, educational_qualification, aadhaar, photograph, cancelled_cheque, terms_and_conditions, consent, raised_by, status, created_at, updated_at, updated_by, reviewed_by.</w:t>
+        <w:t>users_data: id, name, number, user_type, onboarding_link, dob, email, city, state, pincode, pan_card, educational_qualification, aadhaar, photograph, cancelled_cheque, terms_and_conditions, consent, raised_by, status, created_at, updated_at, updated_by, reviewed_by, joining_date, pos_conversion_date.</w:t>
       </w:r>
     </w:p>
     <w:p>
@@ -1493,7 +1673,12 @@
     </w:p>
     <w:p>
       <w:r>
-        <w:t>document_details (Table-2): one row per users_data record (users_data_id FK), holding PAN fields (pan_number, pan_name, pan_father_name, pan_dob, pan_gender), Aadhaar fields (aadhaar_number, aadhaar_name, aadhaar_dob/aadhaar_yob, aadhaar_gender, aadhaar_address, aadhaar_city, aadhaar_district, aadhaar_state, aadhaar_pincode), and Educational Certificate fields (education_student_name, education_father_name, education_mother_name, qualification, course_name, specialization, institution_name, university_board, registration_number, roll_number, examination_name, passing_year, semester_year, total_marks, maximum_marks, percentage, cgpa, grade, result, certificate_number, certificate_issue_date).</w:t>
+        <w:t>joining_date and pos_conversion_date exist to power the Ageing Report (section 6). joining_date is stamped automatically the first time a record's status becomes ACTIVE. pos_conversion_date is stamped only when ops manually converts an ACTIVE POS Referral into a POS — its presence is what marks a record as "converted" in the report, since user_type itself flips from POS_REFERRAL to POS at that point and would otherwise lose the fact that it used to be a referral.</w:t>
+      </w:r>
+    </w:p>
+    <w:p>
+      <w:r>
+        <w:t>document_details: one row per users_data record (users_data_id FK), holding PAN fields (pan_number, pan_name, pan_father_name, pan_dob, pan_gender), Aadhaar fields (aadhaar_number, aadhaar_name, aadhaar_dob/aadhaar_yob, aadhaar_gender, aadhaar_address, aadhaar_city, aadhaar_district, aadhaar_state, aadhaar_pincode), and Educational Certificate fields (education_student_name, education_father_name, education_mother_name, qualification, course_name, specialization, institution_name, university_board, registration_number, roll_number, examination_name, passing_year, semester_year, total_marks, maximum_marks, percentage, cgpa, grade, result, certificate_number, certificate_issue_date).</w:t>
       </w:r>
     </w:p>
     <w:p>
@@ -1501,7 +1686,60 @@
         <w:pStyle w:val="Heading1"/>
       </w:pPr>
       <w:r>
-        <w:t>6. Why the Link Needs No Login</w:t>
+        <w:t>6. Ageing Report</w:t>
+      </w:r>
+    </w:p>
+    <w:p>
+      <w:r>
+        <w:t>Tracks how long a POS Referral stays a referral before being promoted to a full POS: Date of Joining → POS Referral → POS Conversion Date.</w:t>
+      </w:r>
+    </w:p>
+    <w:p>
+      <w:pPr>
+        <w:pStyle w:val="ListBullet"/>
+      </w:pPr>
+      <w:r>
+        <w:t>joining_date is stamped automatically the first time a record's status becomes ACTIVE (ops approves it) — this applies to both POS and POS Referral records, and is "Date of Joining" for the report.</w:t>
+      </w:r>
+    </w:p>
+    <w:p>
+      <w:pPr>
+        <w:pStyle w:val="ListBullet"/>
+      </w:pPr>
+      <w:r>
+        <w:t>Conversion is a manual ops action, not automatic. POST /api/v1/admin/onboarding/{id}/convert-to-pos only succeeds when the record is currently user_type=POS_REFERRAL and status=ACTIVE. It flips user_type to POS and stamps pos_conversion_date.</w:t>
+      </w:r>
+    </w:p>
+    <w:p>
+      <w:pPr>
+        <w:pStyle w:val="ListBullet"/>
+      </w:pPr>
+      <w:r>
+        <w:t>GET /api/v1/admin/reports/ageing lists every record that is currently a POS Referral (PENDING) or was converted from one (CONVERTED) — a plain POS that was never a referral is excluded.</w:t>
+      </w:r>
+    </w:p>
+    <w:p>
+      <w:pPr>
+        <w:pStyle w:val="ListBullet"/>
+      </w:pPr>
+      <w:r>
+        <w:t>Each row returns: date_of_joining, pos_conversion_date (null if still pending), ageing_days (days from joining to conversion, or to today if still pending), conversion_status, and within_90_days.</w:t>
+      </w:r>
+    </w:p>
+    <w:p>
+      <w:pPr>
+        <w:pStyle w:val="ListBullet"/>
+      </w:pPr>
+      <w:r>
+        <w:t>90 days is a target to measure against, not an enforced cutoff — a referral does not expire or auto-convert at 90 days; within_90_days simply flags whether that target was (or is currently being) met.</w:t>
+      </w:r>
+    </w:p>
+    <w:p>
+      <w:pPr>
+        <w:pStyle w:val="Heading1"/>
+      </w:pPr>
+      <w:r>
+        <w:t>7. Why the Link Needs No Login</w:t>
       </w:r>
     </w:p>
     <w:p>
@@ -1530,7 +1768,7 @@
         <w:pStyle w:val="Heading1"/>
       </w:pPr>
       <w:r>
-        <w:t>7. Environment / Wiring Checklist for the Frontend Team</w:t>
+        <w:t>8. Environment / Wiring Checklist for the Frontend Team</w:t>
       </w:r>
     </w:p>
     <w:p>
@@ -1575,12 +1813,12 @@
         <w:pStyle w:val="Heading1"/>
       </w:pPr>
       <w:r>
-        <w:t>8. Dry Run — All APIs in Data-Flow Order</w:t>
+        <w:t>9. Dry Run — All APIs in Data-Flow Order</w:t>
       </w:r>
     </w:p>
     <w:p>
       <w:r>
-        <w:t>A single walkthrough of the entire flow, in the order the system actually calls these APIs, using one example POS onboarding ("Ramesh Kumar") from link generation through approval. Every request/response below is a real shape returned by the API (values shortened/anonymized where noted).</w:t>
+        <w:t>A single walkthrough of the entire flow, in the order the system actually calls these APIs, using one example POS Referral onboarding ("Priya Singh") from link generation through approval and eventual conversion to POS. Every request/response below is a real shape returned by the API (values shortened/anonymized where noted).</w:t>
       </w:r>
     </w:p>
     <w:p>
@@ -1664,7 +1902,7 @@
           <w:sz w:val="18"/>
         </w:rPr>
         <w:br/>
-        <w:t xml:space="preserve">  "name": "Ramesh Kumar",</w:t>
+        <w:t xml:space="preserve">  "name": "Priya Singh",</w:t>
       </w:r>
       <w:r>
         <w:rPr>
@@ -1673,7 +1911,7 @@
           <w:sz w:val="18"/>
         </w:rPr>
         <w:br/>
-        <w:t xml:space="preserve">  "number": "9876543210",</w:t>
+        <w:t xml:space="preserve">  "number": "9123456780",</w:t>
       </w:r>
       <w:r>
         <w:rPr>
@@ -1682,7 +1920,7 @@
           <w:sz w:val="18"/>
         </w:rPr>
         <w:br/>
-        <w:t xml:space="preserve">  "user_type": "POS",</w:t>
+        <w:t xml:space="preserve">  "user_type": "POS_REFERRAL",</w:t>
       </w:r>
       <w:r>
         <w:rPr>
@@ -1691,7 +1929,7 @@
           <w:sz w:val="18"/>
         </w:rPr>
         <w:br/>
-        <w:t xml:space="preserve">  "raised_by": "SM001"</w:t>
+        <w:t xml:space="preserve">  "raised_by": "SM002"</w:t>
       </w:r>
       <w:r>
         <w:rPr>
@@ -1763,7 +2001,7 @@
           <w:sz w:val="18"/>
         </w:rPr>
         <w:br/>
-        <w:t xml:space="preserve">  "id": "TKT-12-09-2026-143059-7",</w:t>
+        <w:t xml:space="preserve">  "id": "TKT-12-09-2026-090000-11",</w:t>
       </w:r>
       <w:r>
         <w:rPr>
@@ -1772,7 +2010,7 @@
           <w:sz w:val="18"/>
         </w:rPr>
         <w:br/>
-        <w:t xml:space="preserve">  "token": "nO5Z-N3WFXRNlU2pPv3Zd57-SMegNOmiNxWvlUIq-Cc",</w:t>
+        <w:t xml:space="preserve">  "token": "8Kq2VnFxAbCdEfGhIjKlMnOpQrStUvWxYz1234567890",</w:t>
       </w:r>
       <w:r>
         <w:rPr>
@@ -1781,7 +2019,7 @@
           <w:sz w:val="18"/>
         </w:rPr>
         <w:br/>
-        <w:t xml:space="preserve">  "onboarding_url": "http://localhost:3000/onboard/pos/nO5Z-N3WFXRNlU2pPv3Zd57-SMegNOmiNxWvlUIq-Cc",</w:t>
+        <w:t xml:space="preserve">  "onboarding_url": "http://localhost:3000/onboard/pos-referral/8Kq2VnFxAbCdEfGhIjKlMnOpQrStUvWxYz1234567890",</w:t>
       </w:r>
       <w:r>
         <w:rPr>
@@ -1799,7 +2037,7 @@
           <w:sz w:val="18"/>
         </w:rPr>
         <w:br/>
-        <w:t xml:space="preserve">    "copy_link": "http://localhost:3000/onboard/pos/nO5Z-...",</w:t>
+        <w:t xml:space="preserve">    "copy_link": "http://localhost:3000/onboard/pos-referral/8Kq2...",</w:t>
       </w:r>
       <w:r>
         <w:rPr>
@@ -1808,7 +2046,7 @@
           <w:sz w:val="18"/>
         </w:rPr>
         <w:br/>
-        <w:t xml:space="preserve">    "whatsapp": "https://wa.me/9876543210?text=...",</w:t>
+        <w:t xml:space="preserve">    "whatsapp": "https://wa.me/9123456780?text=...",</w:t>
       </w:r>
       <w:r>
         <w:rPr>
@@ -1817,7 +2055,7 @@
           <w:sz w:val="18"/>
         </w:rPr>
         <w:br/>
-        <w:t xml:space="preserve">    "sms": "sms:9876543210?body=..."</w:t>
+        <w:t xml:space="preserve">    "sms": "sms:9123456780?body=..."</w:t>
       </w:r>
       <w:r>
         <w:rPr>
@@ -1840,7 +2078,7 @@
     </w:p>
     <w:p>
       <w:r>
-        <w:t>→ users_data row created. id = TKT-12-09-2026-143059-7, status = LINK_GENERATED, onboarding_link = the full onboarding_url shown above (not just the token). SM shares onboarding_url.</w:t>
+        <w:t>→ users_data row created. id = TKT-12-09-2026-090000-11, user_type = POS_REFERRAL, status = LINK_GENERATED, onboarding_link = the full onboarding_url shown above.</w:t>
       </w:r>
     </w:p>
     <w:p>
@@ -1861,7 +2099,7 @@
           <w:b/>
           <w:sz w:val="24"/>
         </w:rPr>
-        <w:t xml:space="preserve">  POS opens the link — frontend resolves the token</w:t>
+        <w:t xml:space="preserve">  Referral opens the link — frontend resolves the token</w:t>
       </w:r>
     </w:p>
     <w:p>
@@ -1894,7 +2132,7 @@
           <w:color w:val="202020"/>
           <w:sz w:val="18"/>
         </w:rPr>
-        <w:t>GET /api/v1/links/nO5Z-N3WFXRNlU2pPv3Zd57-SMegNOmiNxWvlUIq-Cc</w:t>
+        <w:t>GET /api/v1/links/8Kq2...</w:t>
       </w:r>
     </w:p>
     <w:p>
@@ -1957,7 +2195,7 @@
           <w:sz w:val="18"/>
         </w:rPr>
         <w:br/>
-        <w:t xml:space="preserve">  "id": "TKT-12-09-2026-143059-7",</w:t>
+        <w:t xml:space="preserve">  "id": "TKT-12-09-2026-090000-11",</w:t>
       </w:r>
       <w:r>
         <w:rPr>
@@ -1966,7 +2204,7 @@
           <w:sz w:val="18"/>
         </w:rPr>
         <w:br/>
-        <w:t xml:space="preserve">  "name": "Ramesh Kumar",</w:t>
+        <w:t xml:space="preserve">  "name": "Priya Singh",</w:t>
       </w:r>
       <w:r>
         <w:rPr>
@@ -1975,7 +2213,7 @@
           <w:sz w:val="18"/>
         </w:rPr>
         <w:br/>
-        <w:t xml:space="preserve">  "number": "9876543210",</w:t>
+        <w:t xml:space="preserve">  "number": "9123456780",</w:t>
       </w:r>
       <w:r>
         <w:rPr>
@@ -1984,7 +2222,7 @@
           <w:sz w:val="18"/>
         </w:rPr>
         <w:br/>
-        <w:t xml:space="preserve">  "user_type": "POS",</w:t>
+        <w:t xml:space="preserve">  "user_type": "POS_REFERRAL",</w:t>
       </w:r>
       <w:r>
         <w:rPr>
@@ -2006,11 +2244,6 @@
       </w:r>
     </w:p>
     <w:p>
-      <w:r>
-        <w:t>→ Frontend renders the POS form using user_type = POS.</w:t>
-      </w:r>
-    </w:p>
-    <w:p>
       <w:pPr>
         <w:spacing w:before="200" w:after="80"/>
       </w:pPr>
@@ -2028,7 +2261,7 @@
           <w:b/>
           <w:sz w:val="24"/>
         </w:rPr>
-        <w:t xml:space="preserve">  POS fills and saves the form</w:t>
+        <w:t xml:space="preserve">  Referral fills and saves the form, uploads documents, submits</w:t>
       </w:r>
     </w:p>
     <w:p>
@@ -2061,7 +2294,7 @@
           <w:color w:val="202020"/>
           <w:sz w:val="18"/>
         </w:rPr>
-        <w:t>PUT /api/v1/onboarding/nO5Z.../form</w:t>
+        <w:t>PUT /api/v1/onboarding/8Kq2.../form</w:t>
       </w:r>
     </w:p>
     <w:p>
@@ -2082,70 +2315,73 @@
           <w:color w:val="202020"/>
           <w:sz w:val="18"/>
         </w:rPr>
-        <w:t>{</w:t>
+        <w:t>{ "email": "priya@example.com", "city": "Mumbai", "state": "Maharashtra", "consent": "AGREE" }</w:t>
       </w:r>
+    </w:p>
+    <w:p>
+      <w:pPr>
+        <w:spacing w:after="40"/>
+      </w:pPr>
+      <w:r>
+        <w:rPr>
+          <w:b/>
+          <w:sz w:val="20"/>
+        </w:rPr>
+        <w:t>Request</w:t>
+      </w:r>
+    </w:p>
+    <w:p>
+      <w:pPr>
+        <w:spacing w:before="40" w:after="200"/>
+        <w:ind w:left="120"/>
+        <w:shd w:fill="F2F2F2"/>
+        <w:pBdr>
+          <w:top w:val="single" w:sz="4" w:space="4" w:color="CCCCCC"/>
+          <w:left w:val="single" w:sz="4" w:space="4" w:color="CCCCCC"/>
+          <w:bottom w:val="single" w:sz="4" w:space="4" w:color="CCCCCC"/>
+          <w:right w:val="single" w:sz="4" w:space="4" w:color="CCCCCC"/>
+        </w:pBdr>
+      </w:pPr>
       <w:r>
         <w:rPr>
           <w:rFonts w:ascii="Consolas" w:hAnsi="Consolas"/>
           <w:color w:val="202020"/>
           <w:sz w:val="18"/>
         </w:rPr>
-        <w:br/>
-        <w:t xml:space="preserve">  "dob": "1990-01-15",</w:t>
+        <w:t>POST /api/v1/onboarding/8Kq2.../documents?doc_type=PAN_CARD  (+ AADHAAR, PHOTOGRAPH)</w:t>
       </w:r>
+    </w:p>
+    <w:p>
+      <w:pPr>
+        <w:spacing w:after="40"/>
+      </w:pPr>
+      <w:r>
+        <w:rPr>
+          <w:b/>
+          <w:sz w:val="20"/>
+        </w:rPr>
+        <w:t>Request</w:t>
+      </w:r>
+    </w:p>
+    <w:p>
+      <w:pPr>
+        <w:spacing w:before="40" w:after="200"/>
+        <w:ind w:left="120"/>
+        <w:shd w:fill="F2F2F2"/>
+        <w:pBdr>
+          <w:top w:val="single" w:sz="4" w:space="4" w:color="CCCCCC"/>
+          <w:left w:val="single" w:sz="4" w:space="4" w:color="CCCCCC"/>
+          <w:bottom w:val="single" w:sz="4" w:space="4" w:color="CCCCCC"/>
+          <w:right w:val="single" w:sz="4" w:space="4" w:color="CCCCCC"/>
+        </w:pBdr>
+      </w:pPr>
       <w:r>
         <w:rPr>
           <w:rFonts w:ascii="Consolas" w:hAnsi="Consolas"/>
           <w:color w:val="202020"/>
           <w:sz w:val="18"/>
         </w:rPr>
-        <w:br/>
-        <w:t xml:space="preserve">  "email": "ramesh@example.com",</w:t>
-      </w:r>
-      <w:r>
-        <w:rPr>
-          <w:rFonts w:ascii="Consolas" w:hAnsi="Consolas"/>
-          <w:color w:val="202020"/>
-          <w:sz w:val="18"/>
-        </w:rPr>
-        <w:br/>
-        <w:t xml:space="preserve">  "city": "Pune",</w:t>
-      </w:r>
-      <w:r>
-        <w:rPr>
-          <w:rFonts w:ascii="Consolas" w:hAnsi="Consolas"/>
-          <w:color w:val="202020"/>
-          <w:sz w:val="18"/>
-        </w:rPr>
-        <w:br/>
-        <w:t xml:space="preserve">  "state": "Maharashtra",</w:t>
-      </w:r>
-      <w:r>
-        <w:rPr>
-          <w:rFonts w:ascii="Consolas" w:hAnsi="Consolas"/>
-          <w:color w:val="202020"/>
-          <w:sz w:val="18"/>
-        </w:rPr>
-        <w:br/>
-        <w:t xml:space="preserve">  "pincode": "411001",</w:t>
-      </w:r>
-      <w:r>
-        <w:rPr>
-          <w:rFonts w:ascii="Consolas" w:hAnsi="Consolas"/>
-          <w:color w:val="202020"/>
-          <w:sz w:val="18"/>
-        </w:rPr>
-        <w:br/>
-        <w:t xml:space="preserve">  "consent": "AGREE"</w:t>
-      </w:r>
-      <w:r>
-        <w:rPr>
-          <w:rFonts w:ascii="Consolas" w:hAnsi="Consolas"/>
-          <w:color w:val="202020"/>
-          <w:sz w:val="18"/>
-        </w:rPr>
-        <w:br/>
-        <w:t>}</w:t>
+        <w:t>POST /api/v1/onboarding/8Kq2.../submit</w:t>
       </w:r>
     </w:p>
     <w:p>
@@ -2199,219 +2435,7 @@
           <w:color w:val="202020"/>
           <w:sz w:val="18"/>
         </w:rPr>
-        <w:t>{</w:t>
-      </w:r>
-      <w:r>
-        <w:rPr>
-          <w:rFonts w:ascii="Consolas" w:hAnsi="Consolas"/>
-          <w:color w:val="202020"/>
-          <w:sz w:val="18"/>
-        </w:rPr>
-        <w:br/>
-        <w:t xml:space="preserve">  "id": "TKT-12-09-2026-143059-7",</w:t>
-      </w:r>
-      <w:r>
-        <w:rPr>
-          <w:rFonts w:ascii="Consolas" w:hAnsi="Consolas"/>
-          <w:color w:val="202020"/>
-          <w:sz w:val="18"/>
-        </w:rPr>
-        <w:br/>
-        <w:t xml:space="preserve">  "name": "Ramesh Kumar",</w:t>
-      </w:r>
-      <w:r>
-        <w:rPr>
-          <w:rFonts w:ascii="Consolas" w:hAnsi="Consolas"/>
-          <w:color w:val="202020"/>
-          <w:sz w:val="18"/>
-        </w:rPr>
-        <w:br/>
-        <w:t xml:space="preserve">  "number": "9876543210",</w:t>
-      </w:r>
-      <w:r>
-        <w:rPr>
-          <w:rFonts w:ascii="Consolas" w:hAnsi="Consolas"/>
-          <w:color w:val="202020"/>
-          <w:sz w:val="18"/>
-        </w:rPr>
-        <w:br/>
-        <w:t xml:space="preserve">  "user_type": "POS",</w:t>
-      </w:r>
-      <w:r>
-        <w:rPr>
-          <w:rFonts w:ascii="Consolas" w:hAnsi="Consolas"/>
-          <w:color w:val="202020"/>
-          <w:sz w:val="18"/>
-        </w:rPr>
-        <w:br/>
-        <w:t xml:space="preserve">  "status": "FORM_IN_PROGRESS",</w:t>
-      </w:r>
-      <w:r>
-        <w:rPr>
-          <w:rFonts w:ascii="Consolas" w:hAnsi="Consolas"/>
-          <w:color w:val="202020"/>
-          <w:sz w:val="18"/>
-        </w:rPr>
-        <w:br/>
-        <w:t xml:space="preserve">  "raised_by": "SM001",</w:t>
-      </w:r>
-      <w:r>
-        <w:rPr>
-          <w:rFonts w:ascii="Consolas" w:hAnsi="Consolas"/>
-          <w:color w:val="202020"/>
-          <w:sz w:val="18"/>
-        </w:rPr>
-        <w:br/>
-        <w:t xml:space="preserve">  "dob": "1990-01-15",</w:t>
-      </w:r>
-      <w:r>
-        <w:rPr>
-          <w:rFonts w:ascii="Consolas" w:hAnsi="Consolas"/>
-          <w:color w:val="202020"/>
-          <w:sz w:val="18"/>
-        </w:rPr>
-        <w:br/>
-        <w:t xml:space="preserve">  "email": "ramesh@example.com",</w:t>
-      </w:r>
-      <w:r>
-        <w:rPr>
-          <w:rFonts w:ascii="Consolas" w:hAnsi="Consolas"/>
-          <w:color w:val="202020"/>
-          <w:sz w:val="18"/>
-        </w:rPr>
-        <w:br/>
-        <w:t xml:space="preserve">  "city": "Pune",</w:t>
-      </w:r>
-      <w:r>
-        <w:rPr>
-          <w:rFonts w:ascii="Consolas" w:hAnsi="Consolas"/>
-          <w:color w:val="202020"/>
-          <w:sz w:val="18"/>
-        </w:rPr>
-        <w:br/>
-        <w:t xml:space="preserve">  "state": "Maharashtra",</w:t>
-      </w:r>
-      <w:r>
-        <w:rPr>
-          <w:rFonts w:ascii="Consolas" w:hAnsi="Consolas"/>
-          <w:color w:val="202020"/>
-          <w:sz w:val="18"/>
-        </w:rPr>
-        <w:br/>
-        <w:t xml:space="preserve">  "pincode": "411001",</w:t>
-      </w:r>
-      <w:r>
-        <w:rPr>
-          <w:rFonts w:ascii="Consolas" w:hAnsi="Consolas"/>
-          <w:color w:val="202020"/>
-          <w:sz w:val="18"/>
-        </w:rPr>
-        <w:br/>
-        <w:t xml:space="preserve">  "pan_card": null,</w:t>
-      </w:r>
-      <w:r>
-        <w:rPr>
-          <w:rFonts w:ascii="Consolas" w:hAnsi="Consolas"/>
-          <w:color w:val="202020"/>
-          <w:sz w:val="18"/>
-        </w:rPr>
-        <w:br/>
-        <w:t xml:space="preserve">  "aadhaar": null,</w:t>
-      </w:r>
-      <w:r>
-        <w:rPr>
-          <w:rFonts w:ascii="Consolas" w:hAnsi="Consolas"/>
-          <w:color w:val="202020"/>
-          <w:sz w:val="18"/>
-        </w:rPr>
-        <w:br/>
-        <w:t xml:space="preserve">  "photograph": null,</w:t>
-      </w:r>
-      <w:r>
-        <w:rPr>
-          <w:rFonts w:ascii="Consolas" w:hAnsi="Consolas"/>
-          <w:color w:val="202020"/>
-          <w:sz w:val="18"/>
-        </w:rPr>
-        <w:br/>
-        <w:t xml:space="preserve">  "cancelled_cheque": null,</w:t>
-      </w:r>
-      <w:r>
-        <w:rPr>
-          <w:rFonts w:ascii="Consolas" w:hAnsi="Consolas"/>
-          <w:color w:val="202020"/>
-          <w:sz w:val="18"/>
-        </w:rPr>
-        <w:br/>
-        <w:t xml:space="preserve">  "educational_qualification": null,</w:t>
-      </w:r>
-      <w:r>
-        <w:rPr>
-          <w:rFonts w:ascii="Consolas" w:hAnsi="Consolas"/>
-          <w:color w:val="202020"/>
-          <w:sz w:val="18"/>
-        </w:rPr>
-        <w:br/>
-        <w:t xml:space="preserve">  "terms_and_conditions": "we can use your data for onboarding you",</w:t>
-      </w:r>
-      <w:r>
-        <w:rPr>
-          <w:rFonts w:ascii="Consolas" w:hAnsi="Consolas"/>
-          <w:color w:val="202020"/>
-          <w:sz w:val="18"/>
-        </w:rPr>
-        <w:br/>
-        <w:t xml:space="preserve">  "consent": "AGREE",</w:t>
-      </w:r>
-      <w:r>
-        <w:rPr>
-          <w:rFonts w:ascii="Consolas" w:hAnsi="Consolas"/>
-          <w:color w:val="202020"/>
-          <w:sz w:val="18"/>
-        </w:rPr>
-        <w:br/>
-        <w:t xml:space="preserve">  "created_at": "2026-09-12T14:30:59Z",</w:t>
-      </w:r>
-      <w:r>
-        <w:rPr>
-          <w:rFonts w:ascii="Consolas" w:hAnsi="Consolas"/>
-          <w:color w:val="202020"/>
-          <w:sz w:val="18"/>
-        </w:rPr>
-        <w:br/>
-        <w:t xml:space="preserve">  "updated_at": "2026-09-12T14:31:40Z",</w:t>
-      </w:r>
-      <w:r>
-        <w:rPr>
-          <w:rFonts w:ascii="Consolas" w:hAnsi="Consolas"/>
-          <w:color w:val="202020"/>
-          <w:sz w:val="18"/>
-        </w:rPr>
-        <w:br/>
-        <w:t xml:space="preserve">  "updated_by": null,</w:t>
-      </w:r>
-      <w:r>
-        <w:rPr>
-          <w:rFonts w:ascii="Consolas" w:hAnsi="Consolas"/>
-          <w:color w:val="202020"/>
-          <w:sz w:val="18"/>
-        </w:rPr>
-        <w:br/>
-        <w:t xml:space="preserve">  "reviewed_by": null</w:t>
-      </w:r>
-      <w:r>
-        <w:rPr>
-          <w:rFonts w:ascii="Consolas" w:hAnsi="Consolas"/>
-          <w:color w:val="202020"/>
-          <w:sz w:val="18"/>
-        </w:rPr>
-        <w:br/>
-        <w:t>}</w:t>
-      </w:r>
-    </w:p>
-    <w:p>
-      <w:r>
-        <w:t>→ status moves to FORM_IN_PROGRESS. This endpoint can be called again to update fields before submit. Note terms_and_conditions already carries its fixed default value — it wasn't part of this request.</w:t>
+        <w:t>{ "status": "UNDER_REVIEW", "message": "Submitted for operations review" }</w:t>
       </w:r>
     </w:p>
     <w:p>
@@ -2432,7 +2456,7 @@
           <w:b/>
           <w:sz w:val="24"/>
         </w:rPr>
-        <w:t xml:space="preserve">  (Optional) Update the Terms &amp; Conditions text separately</w:t>
+        <w:t xml:space="preserve">  Ops approves — joining_date is stamped</w:t>
       </w:r>
     </w:p>
     <w:p>
@@ -2465,7 +2489,7 @@
           <w:color w:val="202020"/>
           <w:sz w:val="18"/>
         </w:rPr>
-        <w:t>PUT /api/v1/onboarding/nO5Z.../terms-and-conditions</w:t>
+        <w:t>POST /api/v1/admin/onboarding/TKT-12-09-2026-090000-11/review</w:t>
       </w:r>
     </w:p>
     <w:p>
@@ -2486,117 +2510,7 @@
           <w:color w:val="202020"/>
           <w:sz w:val="18"/>
         </w:rPr>
-        <w:t>{</w:t>
-      </w:r>
-      <w:r>
-        <w:rPr>
-          <w:rFonts w:ascii="Consolas" w:hAnsi="Consolas"/>
-          <w:color w:val="202020"/>
-          <w:sz w:val="18"/>
-        </w:rPr>
-        <w:br/>
-        <w:t xml:space="preserve">  "terms_and_conditions": "we can use your data for onboarding you"</w:t>
-      </w:r>
-      <w:r>
-        <w:rPr>
-          <w:rFonts w:ascii="Consolas" w:hAnsi="Consolas"/>
-          <w:color w:val="202020"/>
-          <w:sz w:val="18"/>
-        </w:rPr>
-        <w:br/>
-        <w:t>}</w:t>
-      </w:r>
-    </w:p>
-    <w:p>
-      <w:pPr>
-        <w:spacing w:after="40"/>
-      </w:pPr>
-      <w:r>
-        <w:rPr>
-          <w:b/>
-          <w:sz w:val="20"/>
-        </w:rPr>
-        <w:t>Response (full record returned, same shape as Step 3)</w:t>
-      </w:r>
-    </w:p>
-    <w:p>
-      <w:pPr>
-        <w:spacing w:before="40" w:after="200"/>
-        <w:ind w:left="120"/>
-        <w:shd w:fill="F2F2F2"/>
-        <w:pBdr>
-          <w:top w:val="single" w:sz="4" w:space="4" w:color="CCCCCC"/>
-          <w:left w:val="single" w:sz="4" w:space="4" w:color="CCCCCC"/>
-          <w:bottom w:val="single" w:sz="4" w:space="4" w:color="CCCCCC"/>
-          <w:right w:val="single" w:sz="4" w:space="4" w:color="CCCCCC"/>
-        </w:pBdr>
-      </w:pPr>
-      <w:r>
-        <w:rPr>
-          <w:rFonts w:ascii="Consolas" w:hAnsi="Consolas"/>
-          <w:color w:val="202020"/>
-          <w:sz w:val="18"/>
-        </w:rPr>
-        <w:t>Response 200</w:t>
-      </w:r>
-    </w:p>
-    <w:p>
-      <w:r>
-        <w:t>→ This is the ONLY endpoint that can change terms_and_conditions. It's kept separate from Save Form so the T&amp;C wording can be corrected later without touching any other field. Skip this step in the common case — the fixed default is already correct.</w:t>
-      </w:r>
-    </w:p>
-    <w:p>
-      <w:pPr>
-        <w:spacing w:before="200" w:after="80"/>
-      </w:pPr>
-      <w:r>
-        <w:rPr>
-          <w:b/>
-          <w:color w:val="FFFFFF"/>
-          <w:sz w:val="20"/>
-          <w:shd w:fill="2E5395"/>
-        </w:rPr>
-        <w:t xml:space="preserve"> STEP 5 </w:t>
-      </w:r>
-      <w:r>
-        <w:rPr>
-          <w:b/>
-          <w:sz w:val="24"/>
-        </w:rPr>
-        <w:t xml:space="preserve">  POS uploads documents (one call per file)</w:t>
-      </w:r>
-    </w:p>
-    <w:p>
-      <w:pPr>
-        <w:spacing w:after="40"/>
-      </w:pPr>
-      <w:r>
-        <w:rPr>
-          <w:b/>
-          <w:sz w:val="20"/>
-        </w:rPr>
-        <w:t>Request</w:t>
-      </w:r>
-    </w:p>
-    <w:p>
-      <w:pPr>
-        <w:spacing w:before="40" w:after="200"/>
-        <w:ind w:left="120"/>
-        <w:shd w:fill="F2F2F2"/>
-        <w:pBdr>
-          <w:top w:val="single" w:sz="4" w:space="4" w:color="CCCCCC"/>
-          <w:left w:val="single" w:sz="4" w:space="4" w:color="CCCCCC"/>
-          <w:bottom w:val="single" w:sz="4" w:space="4" w:color="CCCCCC"/>
-          <w:right w:val="single" w:sz="4" w:space="4" w:color="CCCCCC"/>
-        </w:pBdr>
-      </w:pPr>
-      <w:r>
-        <w:rPr>
-          <w:rFonts w:ascii="Consolas" w:hAnsi="Consolas"/>
-          <w:color w:val="202020"/>
-          <w:sz w:val="18"/>
-        </w:rPr>
-        <w:t>POST /api/v1/onboarding/nO5Z.../documents?doc_type=PAN_CARD  (multipart file)</w:t>
+        <w:t>{ "action": "APPROVE", "reviewed_by": "OPS01" }</w:t>
       </w:r>
     </w:p>
     <w:p>
@@ -2650,39 +2564,12 @@
           <w:color w:val="202020"/>
           <w:sz w:val="18"/>
         </w:rPr>
-        <w:t>{</w:t>
-      </w:r>
-      <w:r>
-        <w:rPr>
-          <w:rFonts w:ascii="Consolas" w:hAnsi="Consolas"/>
-          <w:color w:val="202020"/>
-          <w:sz w:val="18"/>
-        </w:rPr>
-        <w:br/>
-        <w:t xml:space="preserve">  "doc_type": "PAN_CARD",</w:t>
-      </w:r>
-      <w:r>
-        <w:rPr>
-          <w:rFonts w:ascii="Consolas" w:hAnsi="Consolas"/>
-          <w:color w:val="202020"/>
-          <w:sz w:val="18"/>
-        </w:rPr>
-        <w:br/>
-        <w:t xml:space="preserve">  "url": "/files/TKT-12-09-2026-143059-7/8e759422e75e431a936f7f9d0066.jpg"</w:t>
-      </w:r>
-      <w:r>
-        <w:rPr>
-          <w:rFonts w:ascii="Consolas" w:hAnsi="Consolas"/>
-          <w:color w:val="202020"/>
-          <w:sz w:val="18"/>
-        </w:rPr>
-        <w:br/>
-        <w:t>}</w:t>
+        <w:t>{ "status": "ACTIVE", "new_onboarding_url": null, "message": "Approved and activated" }</w:t>
       </w:r>
     </w:p>
     <w:p>
       <w:r>
-        <w:t>Repeat with doc_type = AADHAAR, PHOTOGRAPH, CANCELLED_CHEQUE, EDUCATIONAL_QUALIFICATION as applicable — each call sets the matching column on users_data.</w:t>
+        <w:t>→ status = ACTIVE, joining_date = 2026-09-12 (today, since this was the first time status became ACTIVE). Priya Singh is now an active POS Referral.</w:t>
       </w:r>
     </w:p>
     <w:p>
@@ -2696,14 +2583,14 @@
           <w:sz w:val="20"/>
           <w:shd w:fill="2E5395"/>
         </w:rPr>
-        <w:t xml:space="preserve"> STEP 6 </w:t>
+        <w:t xml:space="preserve"> STEP 5 </w:t>
       </w:r>
       <w:r>
         <w:rPr>
           <w:b/>
           <w:sz w:val="24"/>
         </w:rPr>
-        <w:t xml:space="preserve">  (Optional) Save structured PAN/Aadhaar/Education fields</w:t>
+        <w:t xml:space="preserve">  Ops checks the Ageing Report — record shows PENDING</w:t>
       </w:r>
     </w:p>
     <w:p>
@@ -2736,455 +2623,7 @@
           <w:color w:val="202020"/>
           <w:sz w:val="18"/>
         </w:rPr>
-        <w:t>PUT /api/v1/onboarding/nO5Z.../documents/pan-details</w:t>
-      </w:r>
-    </w:p>
-    <w:p>
-      <w:pPr>
-        <w:spacing w:before="40" w:after="200"/>
-        <w:ind w:left="120"/>
-        <w:shd w:fill="F2F2F2"/>
-        <w:pBdr>
-          <w:top w:val="single" w:sz="4" w:space="4" w:color="CCCCCC"/>
-          <w:left w:val="single" w:sz="4" w:space="4" w:color="CCCCCC"/>
-          <w:bottom w:val="single" w:sz="4" w:space="4" w:color="CCCCCC"/>
-          <w:right w:val="single" w:sz="4" w:space="4" w:color="CCCCCC"/>
-        </w:pBdr>
-      </w:pPr>
-      <w:r>
-        <w:rPr>
-          <w:rFonts w:ascii="Consolas" w:hAnsi="Consolas"/>
-          <w:color w:val="202020"/>
-          <w:sz w:val="18"/>
-        </w:rPr>
-        <w:t>{</w:t>
-      </w:r>
-      <w:r>
-        <w:rPr>
-          <w:rFonts w:ascii="Consolas" w:hAnsi="Consolas"/>
-          <w:color w:val="202020"/>
-          <w:sz w:val="18"/>
-        </w:rPr>
-        <w:br/>
-        <w:t xml:space="preserve">  "pan_number": "ABCDE1234F",</w:t>
-      </w:r>
-      <w:r>
-        <w:rPr>
-          <w:rFonts w:ascii="Consolas" w:hAnsi="Consolas"/>
-          <w:color w:val="202020"/>
-          <w:sz w:val="18"/>
-        </w:rPr>
-        <w:br/>
-        <w:t xml:space="preserve">  "pan_name": "RAMESH KUMAR",</w:t>
-      </w:r>
-      <w:r>
-        <w:rPr>
-          <w:rFonts w:ascii="Consolas" w:hAnsi="Consolas"/>
-          <w:color w:val="202020"/>
-          <w:sz w:val="18"/>
-        </w:rPr>
-        <w:br/>
-        <w:t xml:space="preserve">  "pan_father_name": "SURESH KUMAR",</w:t>
-      </w:r>
-      <w:r>
-        <w:rPr>
-          <w:rFonts w:ascii="Consolas" w:hAnsi="Consolas"/>
-          <w:color w:val="202020"/>
-          <w:sz w:val="18"/>
-        </w:rPr>
-        <w:br/>
-        <w:t xml:space="preserve">  "pan_dob": "1990-01-15",</w:t>
-      </w:r>
-      <w:r>
-        <w:rPr>
-          <w:rFonts w:ascii="Consolas" w:hAnsi="Consolas"/>
-          <w:color w:val="202020"/>
-          <w:sz w:val="18"/>
-        </w:rPr>
-        <w:br/>
-        <w:t xml:space="preserve">  "pan_gender": "M"</w:t>
-      </w:r>
-      <w:r>
-        <w:rPr>
-          <w:rFonts w:ascii="Consolas" w:hAnsi="Consolas"/>
-          <w:color w:val="202020"/>
-          <w:sz w:val="18"/>
-        </w:rPr>
-        <w:br/>
-        <w:t>}</w:t>
-      </w:r>
-    </w:p>
-    <w:p>
-      <w:pPr>
-        <w:spacing w:after="40"/>
-      </w:pPr>
-      <w:r>
-        <w:rPr>
-          <w:b/>
-          <w:sz w:val="20"/>
-        </w:rPr>
-        <w:t>Response</w:t>
-      </w:r>
-    </w:p>
-    <w:p>
-      <w:pPr>
-        <w:spacing w:before="40" w:after="200"/>
-        <w:ind w:left="120"/>
-        <w:shd w:fill="F2F2F2"/>
-        <w:pBdr>
-          <w:top w:val="single" w:sz="4" w:space="4" w:color="CCCCCC"/>
-          <w:left w:val="single" w:sz="4" w:space="4" w:color="CCCCCC"/>
-          <w:bottom w:val="single" w:sz="4" w:space="4" w:color="CCCCCC"/>
-          <w:right w:val="single" w:sz="4" w:space="4" w:color="CCCCCC"/>
-        </w:pBdr>
-      </w:pPr>
-      <w:r>
-        <w:rPr>
-          <w:rFonts w:ascii="Consolas" w:hAnsi="Consolas"/>
-          <w:color w:val="202020"/>
-          <w:sz w:val="18"/>
-        </w:rPr>
-        <w:t>Response 200</w:t>
-      </w:r>
-    </w:p>
-    <w:p>
-      <w:pPr>
-        <w:spacing w:before="40" w:after="200"/>
-        <w:ind w:left="120"/>
-        <w:shd w:fill="F2F2F2"/>
-        <w:pBdr>
-          <w:top w:val="single" w:sz="4" w:space="4" w:color="CCCCCC"/>
-          <w:left w:val="single" w:sz="4" w:space="4" w:color="CCCCCC"/>
-          <w:bottom w:val="single" w:sz="4" w:space="4" w:color="CCCCCC"/>
-          <w:right w:val="single" w:sz="4" w:space="4" w:color="CCCCCC"/>
-        </w:pBdr>
-      </w:pPr>
-      <w:r>
-        <w:rPr>
-          <w:rFonts w:ascii="Consolas" w:hAnsi="Consolas"/>
-          <w:color w:val="202020"/>
-          <w:sz w:val="18"/>
-        </w:rPr>
-        <w:t>{ "message": "PAN details saved" }</w:t>
-      </w:r>
-    </w:p>
-    <w:p>
-      <w:r>
-        <w:t>→ document_details row created: id = DOC-12-09-2026-143110-1, users_data_id = TKT-12-09-2026-143059-7. The matching aadhaar-details / education-details endpoints upsert the same row.</w:t>
-      </w:r>
-    </w:p>
-    <w:p>
-      <w:pPr>
-        <w:spacing w:before="200" w:after="80"/>
-      </w:pPr>
-      <w:r>
-        <w:rPr>
-          <w:b/>
-          <w:color w:val="FFFFFF"/>
-          <w:sz w:val="20"/>
-          <w:shd w:fill="2E5395"/>
-        </w:rPr>
-        <w:t xml:space="preserve"> STEP 7 </w:t>
-      </w:r>
-      <w:r>
-        <w:rPr>
-          <w:b/>
-          <w:sz w:val="24"/>
-        </w:rPr>
-        <w:t xml:space="preserve">  POS reviews and submits</w:t>
-      </w:r>
-    </w:p>
-    <w:p>
-      <w:pPr>
-        <w:spacing w:after="40"/>
-      </w:pPr>
-      <w:r>
-        <w:rPr>
-          <w:b/>
-          <w:sz w:val="20"/>
-        </w:rPr>
-        <w:t>Request</w:t>
-      </w:r>
-    </w:p>
-    <w:p>
-      <w:pPr>
-        <w:spacing w:before="40" w:after="200"/>
-        <w:ind w:left="120"/>
-        <w:shd w:fill="F2F2F2"/>
-        <w:pBdr>
-          <w:top w:val="single" w:sz="4" w:space="4" w:color="CCCCCC"/>
-          <w:left w:val="single" w:sz="4" w:space="4" w:color="CCCCCC"/>
-          <w:bottom w:val="single" w:sz="4" w:space="4" w:color="CCCCCC"/>
-          <w:right w:val="single" w:sz="4" w:space="4" w:color="CCCCCC"/>
-        </w:pBdr>
-      </w:pPr>
-      <w:r>
-        <w:rPr>
-          <w:rFonts w:ascii="Consolas" w:hAnsi="Consolas"/>
-          <w:color w:val="202020"/>
-          <w:sz w:val="18"/>
-        </w:rPr>
-        <w:t>GET /api/v1/onboarding/nO5Z.../ (review summary)</w:t>
-      </w:r>
-    </w:p>
-    <w:p>
-      <w:pPr>
-        <w:spacing w:after="40"/>
-      </w:pPr>
-      <w:r>
-        <w:rPr>
-          <w:b/>
-          <w:sz w:val="20"/>
-        </w:rPr>
-        <w:t>Request</w:t>
-      </w:r>
-    </w:p>
-    <w:p>
-      <w:pPr>
-        <w:spacing w:before="40" w:after="200"/>
-        <w:ind w:left="120"/>
-        <w:shd w:fill="F2F2F2"/>
-        <w:pBdr>
-          <w:top w:val="single" w:sz="4" w:space="4" w:color="CCCCCC"/>
-          <w:left w:val="single" w:sz="4" w:space="4" w:color="CCCCCC"/>
-          <w:bottom w:val="single" w:sz="4" w:space="4" w:color="CCCCCC"/>
-          <w:right w:val="single" w:sz="4" w:space="4" w:color="CCCCCC"/>
-        </w:pBdr>
-      </w:pPr>
-      <w:r>
-        <w:rPr>
-          <w:rFonts w:ascii="Consolas" w:hAnsi="Consolas"/>
-          <w:color w:val="202020"/>
-          <w:sz w:val="18"/>
-        </w:rPr>
-        <w:t>POST /api/v1/onboarding/nO5Z.../submit</w:t>
-      </w:r>
-    </w:p>
-    <w:p>
-      <w:pPr>
-        <w:spacing w:after="40"/>
-      </w:pPr>
-      <w:r>
-        <w:rPr>
-          <w:b/>
-          <w:sz w:val="20"/>
-        </w:rPr>
-        <w:t>Response</w:t>
-      </w:r>
-    </w:p>
-    <w:p>
-      <w:pPr>
-        <w:spacing w:before="40" w:after="200"/>
-        <w:ind w:left="120"/>
-        <w:shd w:fill="F2F2F2"/>
-        <w:pBdr>
-          <w:top w:val="single" w:sz="4" w:space="4" w:color="CCCCCC"/>
-          <w:left w:val="single" w:sz="4" w:space="4" w:color="CCCCCC"/>
-          <w:bottom w:val="single" w:sz="4" w:space="4" w:color="CCCCCC"/>
-          <w:right w:val="single" w:sz="4" w:space="4" w:color="CCCCCC"/>
-        </w:pBdr>
-      </w:pPr>
-      <w:r>
-        <w:rPr>
-          <w:rFonts w:ascii="Consolas" w:hAnsi="Consolas"/>
-          <w:color w:val="202020"/>
-          <w:sz w:val="18"/>
-        </w:rPr>
-        <w:t>Response 200</w:t>
-      </w:r>
-    </w:p>
-    <w:p>
-      <w:pPr>
-        <w:spacing w:before="40" w:after="200"/>
-        <w:ind w:left="120"/>
-        <w:shd w:fill="F2F2F2"/>
-        <w:pBdr>
-          <w:top w:val="single" w:sz="4" w:space="4" w:color="CCCCCC"/>
-          <w:left w:val="single" w:sz="4" w:space="4" w:color="CCCCCC"/>
-          <w:bottom w:val="single" w:sz="4" w:space="4" w:color="CCCCCC"/>
-          <w:right w:val="single" w:sz="4" w:space="4" w:color="CCCCCC"/>
-        </w:pBdr>
-      </w:pPr>
-      <w:r>
-        <w:rPr>
-          <w:rFonts w:ascii="Consolas" w:hAnsi="Consolas"/>
-          <w:color w:val="202020"/>
-          <w:sz w:val="18"/>
-        </w:rPr>
-        <w:t>{</w:t>
-      </w:r>
-      <w:r>
-        <w:rPr>
-          <w:rFonts w:ascii="Consolas" w:hAnsi="Consolas"/>
-          <w:color w:val="202020"/>
-          <w:sz w:val="18"/>
-        </w:rPr>
-        <w:br/>
-        <w:t xml:space="preserve">  "status": "UNDER_REVIEW",</w:t>
-      </w:r>
-      <w:r>
-        <w:rPr>
-          <w:rFonts w:ascii="Consolas" w:hAnsi="Consolas"/>
-          <w:color w:val="202020"/>
-          <w:sz w:val="18"/>
-        </w:rPr>
-        <w:br/>
-        <w:t xml:space="preserve">  "message": "Submitted for operations review"</w:t>
-      </w:r>
-      <w:r>
-        <w:rPr>
-          <w:rFonts w:ascii="Consolas" w:hAnsi="Consolas"/>
-          <w:color w:val="202020"/>
-          <w:sz w:val="18"/>
-        </w:rPr>
-        <w:br/>
-        <w:t>}</w:t>
-      </w:r>
-    </w:p>
-    <w:p>
-      <w:r>
-        <w:t>→ Backend checks: name/number present, consent given, required documents (pan_card, aadhaar, photograph) uploaded, and no other ACTIVE/UNDER_REVIEW record shares this mobile number. If anything is missing: 422 with the list of missing fields. If a duplicate exists: 409.</w:t>
-      </w:r>
-    </w:p>
-    <w:p>
-      <w:pPr>
-        <w:spacing w:before="40" w:after="200"/>
-        <w:ind w:left="120"/>
-        <w:shd w:fill="F2F2F2"/>
-        <w:pBdr>
-          <w:top w:val="single" w:sz="4" w:space="4" w:color="CCCCCC"/>
-          <w:left w:val="single" w:sz="4" w:space="4" w:color="CCCCCC"/>
-          <w:bottom w:val="single" w:sz="4" w:space="4" w:color="CCCCCC"/>
-          <w:right w:val="single" w:sz="4" w:space="4" w:color="CCCCCC"/>
-        </w:pBdr>
-      </w:pPr>
-      <w:r>
-        <w:rPr>
-          <w:rFonts w:ascii="Consolas" w:hAnsi="Consolas"/>
-          <w:color w:val="202020"/>
-          <w:sz w:val="18"/>
-        </w:rPr>
-        <w:t>Example failure — Response 422</w:t>
-      </w:r>
-    </w:p>
-    <w:p>
-      <w:pPr>
-        <w:spacing w:before="40" w:after="200"/>
-        <w:ind w:left="120"/>
-        <w:shd w:fill="F2F2F2"/>
-        <w:pBdr>
-          <w:top w:val="single" w:sz="4" w:space="4" w:color="CCCCCC"/>
-          <w:left w:val="single" w:sz="4" w:space="4" w:color="CCCCCC"/>
-          <w:bottom w:val="single" w:sz="4" w:space="4" w:color="CCCCCC"/>
-          <w:right w:val="single" w:sz="4" w:space="4" w:color="CCCCCC"/>
-        </w:pBdr>
-      </w:pPr>
-      <w:r>
-        <w:rPr>
-          <w:rFonts w:ascii="Consolas" w:hAnsi="Consolas"/>
-          <w:color w:val="202020"/>
-          <w:sz w:val="18"/>
-        </w:rPr>
-        <w:t>{</w:t>
-      </w:r>
-      <w:r>
-        <w:rPr>
-          <w:rFonts w:ascii="Consolas" w:hAnsi="Consolas"/>
-          <w:color w:val="202020"/>
-          <w:sz w:val="18"/>
-        </w:rPr>
-        <w:br/>
-        <w:t xml:space="preserve">  "detail": {</w:t>
-      </w:r>
-      <w:r>
-        <w:rPr>
-          <w:rFonts w:ascii="Consolas" w:hAnsi="Consolas"/>
-          <w:color w:val="202020"/>
-          <w:sz w:val="18"/>
-        </w:rPr>
-        <w:br/>
-        <w:t xml:space="preserve">    "message": "Incomplete submission",</w:t>
-      </w:r>
-      <w:r>
-        <w:rPr>
-          <w:rFonts w:ascii="Consolas" w:hAnsi="Consolas"/>
-          <w:color w:val="202020"/>
-          <w:sz w:val="18"/>
-        </w:rPr>
-        <w:br/>
-        <w:t xml:space="preserve">    "missing": ["aadhaar", "consent"]</w:t>
-      </w:r>
-      <w:r>
-        <w:rPr>
-          <w:rFonts w:ascii="Consolas" w:hAnsi="Consolas"/>
-          <w:color w:val="202020"/>
-          <w:sz w:val="18"/>
-        </w:rPr>
-        <w:br/>
-        <w:t xml:space="preserve">  }</w:t>
-      </w:r>
-      <w:r>
-        <w:rPr>
-          <w:rFonts w:ascii="Consolas" w:hAnsi="Consolas"/>
-          <w:color w:val="202020"/>
-          <w:sz w:val="18"/>
-        </w:rPr>
-        <w:br/>
-        <w:t>}</w:t>
-      </w:r>
-    </w:p>
-    <w:p>
-      <w:pPr>
-        <w:spacing w:before="200" w:after="80"/>
-      </w:pPr>
-      <w:r>
-        <w:rPr>
-          <w:b/>
-          <w:color w:val="FFFFFF"/>
-          <w:sz w:val="20"/>
-          <w:shd w:fill="2E5395"/>
-        </w:rPr>
-        <w:t xml:space="preserve"> STEP 8 </w:t>
-      </w:r>
-      <w:r>
-        <w:rPr>
-          <w:b/>
-          <w:sz w:val="24"/>
-        </w:rPr>
-        <w:t xml:space="preserve">  Ops opens the review queue</w:t>
-      </w:r>
-    </w:p>
-    <w:p>
-      <w:pPr>
-        <w:spacing w:after="40"/>
-      </w:pPr>
-      <w:r>
-        <w:rPr>
-          <w:b/>
-          <w:sz w:val="20"/>
-        </w:rPr>
-        <w:t>Request</w:t>
-      </w:r>
-    </w:p>
-    <w:p>
-      <w:pPr>
-        <w:spacing w:before="40" w:after="200"/>
-        <w:ind w:left="120"/>
-        <w:shd w:fill="F2F2F2"/>
-        <w:pBdr>
-          <w:top w:val="single" w:sz="4" w:space="4" w:color="CCCCCC"/>
-          <w:left w:val="single" w:sz="4" w:space="4" w:color="CCCCCC"/>
-          <w:bottom w:val="single" w:sz="4" w:space="4" w:color="CCCCCC"/>
-          <w:right w:val="single" w:sz="4" w:space="4" w:color="CCCCCC"/>
-        </w:pBdr>
-      </w:pPr>
-      <w:r>
-        <w:rPr>
-          <w:rFonts w:ascii="Consolas" w:hAnsi="Consolas"/>
-          <w:color w:val="202020"/>
-          <w:sz w:val="18"/>
-        </w:rPr>
-        <w:t>GET /api/v1/admin/onboarding?status=UNDER_REVIEW</w:t>
+        <w:t>GET /api/v1/admin/reports/ageing</w:t>
       </w:r>
     </w:p>
     <w:p>
@@ -3256,7 +2695,7 @@
           <w:sz w:val="18"/>
         </w:rPr>
         <w:br/>
-        <w:t xml:space="preserve">    "id": "TKT-12-09-2026-143059-7",</w:t>
+        <w:t xml:space="preserve">    "id": "TKT-12-09-2026-090000-11",</w:t>
       </w:r>
       <w:r>
         <w:rPr>
@@ -3265,7 +2704,7 @@
           <w:sz w:val="18"/>
         </w:rPr>
         <w:br/>
-        <w:t xml:space="preserve">    "name": "Ramesh Kumar",</w:t>
+        <w:t xml:space="preserve">    "name": "Priya Singh",</w:t>
       </w:r>
       <w:r>
         <w:rPr>
@@ -3274,7 +2713,7 @@
           <w:sz w:val="18"/>
         </w:rPr>
         <w:br/>
-        <w:t xml:space="preserve">    "number": "9876543210",</w:t>
+        <w:t xml:space="preserve">    "number": "9123456780",</w:t>
       </w:r>
       <w:r>
         <w:rPr>
@@ -3283,7 +2722,7 @@
           <w:sz w:val="18"/>
         </w:rPr>
         <w:br/>
-        <w:t xml:space="preserve">    "user_type": "POS",</w:t>
+        <w:t xml:space="preserve">    "raised_by": "SM002",</w:t>
       </w:r>
       <w:r>
         <w:rPr>
@@ -3292,7 +2731,7 @@
           <w:sz w:val="18"/>
         </w:rPr>
         <w:br/>
-        <w:t xml:space="preserve">    "status": "UNDER_REVIEW",</w:t>
+        <w:t xml:space="preserve">    "date_of_joining": "2026-09-12",</w:t>
       </w:r>
       <w:r>
         <w:rPr>
@@ -3301,7 +2740,7 @@
           <w:sz w:val="18"/>
         </w:rPr>
         <w:br/>
-        <w:t xml:space="preserve">    "raised_by": "SM001",</w:t>
+        <w:t xml:space="preserve">    "pos_conversion_date": null,</w:t>
       </w:r>
       <w:r>
         <w:rPr>
@@ -3310,7 +2749,25 @@
           <w:sz w:val="18"/>
         </w:rPr>
         <w:br/>
-        <w:t xml:space="preserve">    "created_at": "2026-09-12T14:30:59Z"</w:t>
+        <w:t xml:space="preserve">    "ageing_days": 33,</w:t>
+      </w:r>
+      <w:r>
+        <w:rPr>
+          <w:rFonts w:ascii="Consolas" w:hAnsi="Consolas"/>
+          <w:color w:val="202020"/>
+          <w:sz w:val="18"/>
+        </w:rPr>
+        <w:br/>
+        <w:t xml:space="preserve">    "conversion_status": "PENDING",</w:t>
+      </w:r>
+      <w:r>
+        <w:rPr>
+          <w:rFonts w:ascii="Consolas" w:hAnsi="Consolas"/>
+          <w:color w:val="202020"/>
+          <w:sz w:val="18"/>
+        </w:rPr>
+        <w:br/>
+        <w:t xml:space="preserve">    "within_90_days": true</w:t>
       </w:r>
       <w:r>
         <w:rPr>
@@ -3332,6 +2789,11 @@
       </w:r>
     </w:p>
     <w:p>
+      <w:r>
+        <w:t>→ ageing_days counts up from joining_date to today since pos_conversion_date is still null. within_90_days stays true as long as that count is ≤ 90.</w:t>
+      </w:r>
+    </w:p>
+    <w:p>
       <w:pPr>
         <w:spacing w:before="200" w:after="80"/>
       </w:pPr>
@@ -3342,14 +2804,14 @@
           <w:sz w:val="20"/>
           <w:shd w:fill="2E5395"/>
         </w:rPr>
-        <w:t xml:space="preserve"> STEP 9 </w:t>
+        <w:t xml:space="preserve"> STEP 6 </w:t>
       </w:r>
       <w:r>
         <w:rPr>
           <w:b/>
           <w:sz w:val="24"/>
         </w:rPr>
-        <w:t xml:space="preserve">  Ops approves the record</w:t>
+        <w:t xml:space="preserve">  (Weeks later) Ops converts Priya Singh from POS Referral to POS</w:t>
       </w:r>
     </w:p>
     <w:p>
@@ -3382,7 +2844,7 @@
           <w:color w:val="202020"/>
           <w:sz w:val="18"/>
         </w:rPr>
-        <w:t>POST /api/v1/admin/onboarding/TKT-12-09-2026-143059-7/review</w:t>
+        <w:t>POST /api/v1/admin/onboarding/TKT-12-09-2026-090000-11/convert-to-pos</w:t>
       </w:r>
     </w:p>
     <w:p>
@@ -3403,34 +2865,7 @@
           <w:color w:val="202020"/>
           <w:sz w:val="18"/>
         </w:rPr>
-        <w:t>{</w:t>
-      </w:r>
-      <w:r>
-        <w:rPr>
-          <w:rFonts w:ascii="Consolas" w:hAnsi="Consolas"/>
-          <w:color w:val="202020"/>
-          <w:sz w:val="18"/>
-        </w:rPr>
-        <w:br/>
-        <w:t xml:space="preserve">  "action": "APPROVE",</w:t>
-      </w:r>
-      <w:r>
-        <w:rPr>
-          <w:rFonts w:ascii="Consolas" w:hAnsi="Consolas"/>
-          <w:color w:val="202020"/>
-          <w:sz w:val="18"/>
-        </w:rPr>
-        <w:br/>
-        <w:t xml:space="preserve">  "reviewed_by": "OPS01"</w:t>
-      </w:r>
-      <w:r>
-        <w:rPr>
-          <w:rFonts w:ascii="Consolas" w:hAnsi="Consolas"/>
-          <w:color w:val="202020"/>
-          <w:sz w:val="18"/>
-        </w:rPr>
-        <w:br/>
-        <w:t>}</w:t>
+        <w:t>{ "converted_by": "OPS01" }</w:t>
       </w:r>
     </w:p>
     <w:p>
@@ -3493,7 +2928,7 @@
           <w:sz w:val="18"/>
         </w:rPr>
         <w:br/>
-        <w:t xml:space="preserve">  "status": "ACTIVE",</w:t>
+        <w:t xml:space="preserve">  "id": "TKT-12-09-2026-090000-11",</w:t>
       </w:r>
       <w:r>
         <w:rPr>
@@ -3502,7 +2937,7 @@
           <w:sz w:val="18"/>
         </w:rPr>
         <w:br/>
-        <w:t xml:space="preserve">  "new_onboarding_url": null,</w:t>
+        <w:t xml:space="preserve">  "user_type": "POS",</w:t>
       </w:r>
       <w:r>
         <w:rPr>
@@ -3511,7 +2946,34 @@
           <w:sz w:val="18"/>
         </w:rPr>
         <w:br/>
-        <w:t xml:space="preserve">  "message": "Approved and activated"</w:t>
+        <w:t xml:space="preserve">  "joining_date": "2026-09-12",</w:t>
+      </w:r>
+      <w:r>
+        <w:rPr>
+          <w:rFonts w:ascii="Consolas" w:hAnsi="Consolas"/>
+          <w:color w:val="202020"/>
+          <w:sz w:val="18"/>
+        </w:rPr>
+        <w:br/>
+        <w:t xml:space="preserve">  "pos_conversion_date": "2026-10-15",</w:t>
+      </w:r>
+      <w:r>
+        <w:rPr>
+          <w:rFonts w:ascii="Consolas" w:hAnsi="Consolas"/>
+          <w:color w:val="202020"/>
+          <w:sz w:val="18"/>
+        </w:rPr>
+        <w:br/>
+        <w:t xml:space="preserve">  "ageing_days": 33,</w:t>
+      </w:r>
+      <w:r>
+        <w:rPr>
+          <w:rFonts w:ascii="Consolas" w:hAnsi="Consolas"/>
+          <w:color w:val="202020"/>
+          <w:sz w:val="18"/>
+        </w:rPr>
+        <w:br/>
+        <w:t xml:space="preserve">  "message": "Converted from POS Referral to POS"</w:t>
       </w:r>
       <w:r>
         <w:rPr>
@@ -3525,7 +2987,7 @@
     </w:p>
     <w:p>
       <w:r>
-        <w:t>→ Onboarding complete. Ramesh Kumar's users_data row is now ACTIVE, and reviewed_by is set to "OPS01" on the record (visible via GET .../onboarding/{token}).</w:t>
+        <w:t>→ user_type flips to POS; pos_conversion_date is stamped; ageing_days is now final (33 days from joining to conversion). This only works because the record was user_type=POS_REFERRAL and status=ACTIVE — attempting it on a plain POS, or on a record still UNDER_REVIEW, returns 409.</w:t>
       </w:r>
     </w:p>
     <w:p>
@@ -3539,14 +3001,14 @@
           <w:sz w:val="20"/>
           <w:shd w:fill="2E5395"/>
         </w:rPr>
-        <w:t xml:space="preserve"> STEP 9b </w:t>
+        <w:t xml:space="preserve"> STEP 7 </w:t>
       </w:r>
       <w:r>
         <w:rPr>
           <w:b/>
           <w:sz w:val="24"/>
         </w:rPr>
-        <w:t xml:space="preserve">  Alternative outcome — Ops sends it back for corrections</w:t>
+        <w:t xml:space="preserve">  Ops checks the Ageing Report again — record now shows CONVERTED</w:t>
       </w:r>
     </w:p>
     <w:p>
@@ -3579,55 +3041,7 @@
           <w:color w:val="202020"/>
           <w:sz w:val="18"/>
         </w:rPr>
-        <w:t>POST /api/v1/admin/onboarding/TKT-12-09-2026-143059-7/review</w:t>
-      </w:r>
-    </w:p>
-    <w:p>
-      <w:pPr>
-        <w:spacing w:before="40" w:after="200"/>
-        <w:ind w:left="120"/>
-        <w:shd w:fill="F2F2F2"/>
-        <w:pBdr>
-          <w:top w:val="single" w:sz="4" w:space="4" w:color="CCCCCC"/>
-          <w:left w:val="single" w:sz="4" w:space="4" w:color="CCCCCC"/>
-          <w:bottom w:val="single" w:sz="4" w:space="4" w:color="CCCCCC"/>
-          <w:right w:val="single" w:sz="4" w:space="4" w:color="CCCCCC"/>
-        </w:pBdr>
-      </w:pPr>
-      <w:r>
-        <w:rPr>
-          <w:rFonts w:ascii="Consolas" w:hAnsi="Consolas"/>
-          <w:color w:val="202020"/>
-          <w:sz w:val="18"/>
-        </w:rPr>
-        <w:t>{</w:t>
-      </w:r>
-      <w:r>
-        <w:rPr>
-          <w:rFonts w:ascii="Consolas" w:hAnsi="Consolas"/>
-          <w:color w:val="202020"/>
-          <w:sz w:val="18"/>
-        </w:rPr>
-        <w:br/>
-        <w:t xml:space="preserve">  "action": "SEND_BACK",</w:t>
-      </w:r>
-      <w:r>
-        <w:rPr>
-          <w:rFonts w:ascii="Consolas" w:hAnsi="Consolas"/>
-          <w:color w:val="202020"/>
-          <w:sz w:val="18"/>
-        </w:rPr>
-        <w:br/>
-        <w:t xml:space="preserve">  "reviewed_by": "OPS01"</w:t>
-      </w:r>
-      <w:r>
-        <w:rPr>
-          <w:rFonts w:ascii="Consolas" w:hAnsi="Consolas"/>
-          <w:color w:val="202020"/>
-          <w:sz w:val="18"/>
-        </w:rPr>
-        <w:br/>
-        <w:t>}</w:t>
+        <w:t>GET /api/v1/admin/reports/ageing</w:t>
       </w:r>
     </w:p>
     <w:p>
@@ -3681,7 +3095,7 @@
           <w:color w:val="202020"/>
           <w:sz w:val="18"/>
         </w:rPr>
-        <w:t>{</w:t>
+        <w:t>[</w:t>
       </w:r>
       <w:r>
         <w:rPr>
@@ -3690,7 +3104,7 @@
           <w:sz w:val="18"/>
         </w:rPr>
         <w:br/>
-        <w:t xml:space="preserve">  "status": "SEND_BACK",</w:t>
+        <w:t xml:space="preserve">  {</w:t>
       </w:r>
       <w:r>
         <w:rPr>
@@ -3699,7 +3113,7 @@
           <w:sz w:val="18"/>
         </w:rPr>
         <w:br/>
-        <w:t xml:space="preserve">  "new_onboarding_url": "http://localhost:3000/onboard/pos/8Kq2-newTokenValue...",</w:t>
+        <w:t xml:space="preserve">    "id": "TKT-12-09-2026-090000-11",</w:t>
       </w:r>
       <w:r>
         <w:rPr>
@@ -3708,7 +3122,7 @@
           <w:sz w:val="18"/>
         </w:rPr>
         <w:br/>
-        <w:t xml:space="preserve">  "message": "Sent back for corrections, new link issued"</w:t>
+        <w:t xml:space="preserve">    "name": "Priya Singh",</w:t>
       </w:r>
       <w:r>
         <w:rPr>
@@ -3717,87 +3131,7 @@
           <w:sz w:val="18"/>
         </w:rPr>
         <w:br/>
-        <w:t>}</w:t>
-      </w:r>
-    </w:p>
-    <w:p>
-      <w:r>
-        <w:t>→ The old token is invalidated and a new one is generated (new_onboarding_url). Resend that link to Ramesh Kumar and the flow restarts from Step 2 on the new link.</w:t>
-      </w:r>
-    </w:p>
-    <w:p>
-      <w:pPr>
-        <w:spacing w:before="200" w:after="80"/>
-      </w:pPr>
-      <w:r>
-        <w:rPr>
-          <w:b/>
-          <w:color w:val="FFFFFF"/>
-          <w:sz w:val="20"/>
-          <w:shd w:fill="2E5395"/>
-        </w:rPr>
-        <w:t xml:space="preserve"> STEP 9c </w:t>
-      </w:r>
-      <w:r>
-        <w:rPr>
-          <w:b/>
-          <w:sz w:val="24"/>
-        </w:rPr>
-        <w:t xml:space="preserve">  Alternative outcome — Ops rejects the record</w:t>
-      </w:r>
-    </w:p>
-    <w:p>
-      <w:pPr>
-        <w:spacing w:after="40"/>
-      </w:pPr>
-      <w:r>
-        <w:rPr>
-          <w:b/>
-          <w:sz w:val="20"/>
-        </w:rPr>
-        <w:t>Request</w:t>
-      </w:r>
-    </w:p>
-    <w:p>
-      <w:pPr>
-        <w:spacing w:before="40" w:after="200"/>
-        <w:ind w:left="120"/>
-        <w:shd w:fill="F2F2F2"/>
-        <w:pBdr>
-          <w:top w:val="single" w:sz="4" w:space="4" w:color="CCCCCC"/>
-          <w:left w:val="single" w:sz="4" w:space="4" w:color="CCCCCC"/>
-          <w:bottom w:val="single" w:sz="4" w:space="4" w:color="CCCCCC"/>
-          <w:right w:val="single" w:sz="4" w:space="4" w:color="CCCCCC"/>
-        </w:pBdr>
-      </w:pPr>
-      <w:r>
-        <w:rPr>
-          <w:rFonts w:ascii="Consolas" w:hAnsi="Consolas"/>
-          <w:color w:val="202020"/>
-          <w:sz w:val="18"/>
-        </w:rPr>
-        <w:t>POST /api/v1/admin/onboarding/TKT-12-09-2026-143059-7/review</w:t>
-      </w:r>
-    </w:p>
-    <w:p>
-      <w:pPr>
-        <w:spacing w:before="40" w:after="200"/>
-        <w:ind w:left="120"/>
-        <w:shd w:fill="F2F2F2"/>
-        <w:pBdr>
-          <w:top w:val="single" w:sz="4" w:space="4" w:color="CCCCCC"/>
-          <w:left w:val="single" w:sz="4" w:space="4" w:color="CCCCCC"/>
-          <w:bottom w:val="single" w:sz="4" w:space="4" w:color="CCCCCC"/>
-          <w:right w:val="single" w:sz="4" w:space="4" w:color="CCCCCC"/>
-        </w:pBdr>
-      </w:pPr>
-      <w:r>
-        <w:rPr>
-          <w:rFonts w:ascii="Consolas" w:hAnsi="Consolas"/>
-          <w:color w:val="202020"/>
-          <w:sz w:val="18"/>
-        </w:rPr>
-        <w:t>{</w:t>
+        <w:t xml:space="preserve">    "number": "9123456780",</w:t>
       </w:r>
       <w:r>
         <w:rPr>
@@ -3806,7 +3140,7 @@
           <w:sz w:val="18"/>
         </w:rPr>
         <w:br/>
-        <w:t xml:space="preserve">  "action": "REJECT",</w:t>
+        <w:t xml:space="preserve">    "raised_by": "SM002",</w:t>
       </w:r>
       <w:r>
         <w:rPr>
@@ -3815,7 +3149,7 @@
           <w:sz w:val="18"/>
         </w:rPr>
         <w:br/>
-        <w:t xml:space="preserve">  "reviewed_by": "OPS01"</w:t>
+        <w:t xml:space="preserve">    "date_of_joining": "2026-09-12",</w:t>
       </w:r>
       <w:r>
         <w:rPr>
@@ -3824,61 +3158,7 @@
           <w:sz w:val="18"/>
         </w:rPr>
         <w:br/>
-        <w:t>}</w:t>
-      </w:r>
-    </w:p>
-    <w:p>
-      <w:pPr>
-        <w:spacing w:after="40"/>
-      </w:pPr>
-      <w:r>
-        <w:rPr>
-          <w:b/>
-          <w:sz w:val="20"/>
-        </w:rPr>
-        <w:t>Response</w:t>
-      </w:r>
-    </w:p>
-    <w:p>
-      <w:pPr>
-        <w:spacing w:before="40" w:after="200"/>
-        <w:ind w:left="120"/>
-        <w:shd w:fill="F2F2F2"/>
-        <w:pBdr>
-          <w:top w:val="single" w:sz="4" w:space="4" w:color="CCCCCC"/>
-          <w:left w:val="single" w:sz="4" w:space="4" w:color="CCCCCC"/>
-          <w:bottom w:val="single" w:sz="4" w:space="4" w:color="CCCCCC"/>
-          <w:right w:val="single" w:sz="4" w:space="4" w:color="CCCCCC"/>
-        </w:pBdr>
-      </w:pPr>
-      <w:r>
-        <w:rPr>
-          <w:rFonts w:ascii="Consolas" w:hAnsi="Consolas"/>
-          <w:color w:val="202020"/>
-          <w:sz w:val="18"/>
-        </w:rPr>
-        <w:t>Response 200</w:t>
-      </w:r>
-    </w:p>
-    <w:p>
-      <w:pPr>
-        <w:spacing w:before="40" w:after="200"/>
-        <w:ind w:left="120"/>
-        <w:shd w:fill="F2F2F2"/>
-        <w:pBdr>
-          <w:top w:val="single" w:sz="4" w:space="4" w:color="CCCCCC"/>
-          <w:left w:val="single" w:sz="4" w:space="4" w:color="CCCCCC"/>
-          <w:bottom w:val="single" w:sz="4" w:space="4" w:color="CCCCCC"/>
-          <w:right w:val="single" w:sz="4" w:space="4" w:color="CCCCCC"/>
-        </w:pBdr>
-      </w:pPr>
-      <w:r>
-        <w:rPr>
-          <w:rFonts w:ascii="Consolas" w:hAnsi="Consolas"/>
-          <w:color w:val="202020"/>
-          <w:sz w:val="18"/>
-        </w:rPr>
-        <w:t>{</w:t>
+        <w:t xml:space="preserve">    "pos_conversion_date": "2026-10-15",</w:t>
       </w:r>
       <w:r>
         <w:rPr>
@@ -3887,7 +3167,7 @@
           <w:sz w:val="18"/>
         </w:rPr>
         <w:br/>
-        <w:t xml:space="preserve">  "status": "REJECTED",</w:t>
+        <w:t xml:space="preserve">    "ageing_days": 33,</w:t>
       </w:r>
       <w:r>
         <w:rPr>
@@ -3896,7 +3176,7 @@
           <w:sz w:val="18"/>
         </w:rPr>
         <w:br/>
-        <w:t xml:space="preserve">  "new_onboarding_url": null,</w:t>
+        <w:t xml:space="preserve">    "conversion_status": "CONVERTED",</w:t>
       </w:r>
       <w:r>
         <w:rPr>
@@ -3905,7 +3185,7 @@
           <w:sz w:val="18"/>
         </w:rPr>
         <w:br/>
-        <w:t xml:space="preserve">  "message": "Rejected"</w:t>
+        <w:t xml:space="preserve">    "within_90_days": true</w:t>
       </w:r>
       <w:r>
         <w:rPr>
@@ -3914,12 +3194,21 @@
           <w:sz w:val="18"/>
         </w:rPr>
         <w:br/>
-        <w:t>}</w:t>
+        <w:t xml:space="preserve">  }</w:t>
+      </w:r>
+      <w:r>
+        <w:rPr>
+          <w:rFonts w:ascii="Consolas" w:hAnsi="Consolas"/>
+          <w:color w:val="202020"/>
+          <w:sz w:val="18"/>
+        </w:rPr>
+        <w:br/>
+        <w:t>]</w:t>
       </w:r>
     </w:p>
     <w:p>
       <w:r>
-        <w:t>→ Terminal state. No further action possible on this record.</w:t>
+        <w:t>→ The record still shows up here (it was converted FROM a referral), but ageing_days is now fixed at 33 and won't change on future report reads. A record that was always a plain POS (never a referral) never appears in this report.</w:t>
       </w:r>
     </w:p>
     <w:sectPr>

</xml_diff>